<commit_message>
feat(capstone): complete UAT & ISO 25010 evaluation suite, term governance, analytics overhaul, and production assets
</commit_message>
<xml_diff>
--- a/docs/Research_Participant_Interview_Consent_Form.docx
+++ b/docs/Research_Participant_Interview_Consent_Form.docx
@@ -1,73 +1,117 @@
 
 <file path=word/document.xml><?xml version="1.0" encoding="utf-8"?>
-<w:document xmlns:wpc="http://schemas.microsoft.com/office/word/2010/wordprocessingCanvas" xmlns:cx="http://schemas.microsoft.com/office/drawing/2014/chartex" xmlns:cx1="http://schemas.microsoft.com/office/drawing/2015/9/8/chartex" xmlns:cx2="http://schemas.microsoft.com/office/drawing/2015/10/21/chartex" xmlns:cx3="http://schemas.microsoft.com/office/drawing/2016/5/9/chartex" xmlns:cx4="http://schemas.microsoft.com/office/drawing/2016/5/10/chartex" xmlns:cx5="http://schemas.microsoft.com/office/drawing/2016/5/11/chartex" xmlns:cx6="http://schemas.microsoft.com/office/drawing/2016/5/12/chartex" xmlns:cx7="http://schemas.microsoft.com/office/drawing/2016/5/13/chartex" xmlns:cx8="http://schemas.microsoft.com/office/drawing/2016/5/14/chartex" xmlns:mc="http://schemas.openxmlformats.org/markup-compatibility/2006" xmlns:m="http://schemas.openxmlformats.org/officeDocument/2006/math" xmlns:aink="http://schemas.microsoft.com/office/drawing/2016/ink" xmlns:am3d="http://schemas.microsoft.com/office/drawing/2017/model3d" xmlns:oel="http://schemas.microsoft.com/office/2019/extlst" xmlns:r="http://schemas.openxmlformats.org/officeDocument/2006/relationships" xmlns:wp14="http://schemas.microsoft.com/office/word/2010/wordprocessingDrawing" xmlns:wp="http://schemas.openxmlformats.org/drawingml/2006/wordprocessingDrawing" xmlns:wpg="http://schemas.microsoft.com/office/word/2010/wordprocessingGroup" xmlns:wpi="http://schemas.microsoft.com/office/word/2010/wordprocessingInk" xmlns:wps="http://schemas.microsoft.com/office/word/2010/wordprocessingShape" xmlns:o="urn:schemas-microsoft-com:office:office" xmlns:v="urn:schemas-microsoft-com:vml" xmlns:w10="urn:schemas-microsoft-com:office:word" xmlns:w="http://schemas.openxmlformats.org/wordprocessingml/2006/main" xmlns:w14="http://schemas.microsoft.com/office/word/2010/wordml" xmlns:w15="http://schemas.microsoft.com/office/word/2012/wordml" xmlns:w16cei="http://schemas.microsoft.com/office/word/2026/wordml/cei" xmlns:w16cex="http://schemas.microsoft.com/office/word/2018/wordml/cex" xmlns:w16cid="http://schemas.microsoft.com/office/word/2016/wordml/cid" xmlns:w16="http://schemas.microsoft.com/office/word/2018/wordml" xmlns:w16sdtdh="http://schemas.microsoft.com/office/word/2020/wordml/sdtdatahash" xmlns:w16sdtfl="http://schemas.microsoft.com/office/word/2024/wordml/sdtformatlock" xmlns:w16se="http://schemas.microsoft.com/office/word/2015/wordml/symex" xmlns:w16du="http://schemas.microsoft.com/office/word/2023/wordml/word16du" xmlns:wne="http://schemas.microsoft.com/office/word/2006/wordml" mc:Ignorable="w14 w15 w16se w16cid w16 w16cex w16sdtdh w16sdtfl w16du wp14">
+<w:document xmlns:wpc="http://schemas.microsoft.com/office/word/2010/wordprocessingCanvas" xmlns:cx="http://schemas.microsoft.com/office/drawing/2014/chartex" xmlns:cx1="http://schemas.microsoft.com/office/drawing/2015/9/8/chartex" xmlns:cx2="http://schemas.microsoft.com/office/drawing/2015/10/21/chartex" xmlns:cx3="http://schemas.microsoft.com/office/drawing/2016/5/9/chartex" xmlns:cx4="http://schemas.microsoft.com/office/drawing/2016/5/10/chartex" xmlns:cx5="http://schemas.microsoft.com/office/drawing/2016/5/11/chartex" xmlns:cx6="http://schemas.microsoft.com/office/drawing/2016/5/12/chartex" xmlns:cx7="http://schemas.microsoft.com/office/drawing/2016/5/13/chartex" xmlns:cx8="http://schemas.microsoft.com/office/drawing/2016/5/14/chartex" xmlns:mc="http://schemas.openxmlformats.org/markup-compatibility/2006" xmlns:aink="http://schemas.microsoft.com/office/drawing/2016/ink" xmlns:am3d="http://schemas.microsoft.com/office/drawing/2017/model3d" xmlns:o="urn:schemas-microsoft-com:office:office" xmlns:r="http://schemas.openxmlformats.org/officeDocument/2006/relationships" xmlns:m="http://schemas.openxmlformats.org/officeDocument/2006/math" xmlns:v="urn:schemas-microsoft-com:vml" xmlns:wp14="http://schemas.microsoft.com/office/word/2010/wordprocessingDrawing" xmlns:wp="http://schemas.openxmlformats.org/drawingml/2006/wordprocessingDrawing" xmlns:w10="urn:schemas-microsoft-com:office:word" xmlns:w="http://schemas.openxmlformats.org/wordprocessingml/2006/main" xmlns:w14="http://schemas.microsoft.com/office/word/2010/wordml" xmlns:w15="http://schemas.microsoft.com/office/word/2012/wordml" xmlns:w16cex="http://schemas.microsoft.com/office/word/2018/wordml/cex" xmlns:w16cid="http://schemas.microsoft.com/office/word/2016/wordml/cid" xmlns:w16="http://schemas.microsoft.com/office/word/2018/wordml" xmlns:w16sdtdh="http://schemas.microsoft.com/office/word/2020/wordml/sdtdatahash" xmlns:w16se="http://schemas.microsoft.com/office/word/2015/wordml/symex" xmlns:wpg="http://schemas.microsoft.com/office/word/2010/wordprocessingGroup" xmlns:wpi="http://schemas.microsoft.com/office/word/2010/wordprocessingInk" xmlns:wne="http://schemas.microsoft.com/office/word/2006/wordml" xmlns:wps="http://schemas.microsoft.com/office/word/2010/wordprocessingShape" mc:Ignorable="w14 w15 w16se w16cid w16 w16cex w16sdtdh wp14">
   <w:body>
     <w:p>
       <w:pPr>
-        <w:spacing w:after="40" w:before="0"/>
+        <w:spacing w:after="40" w:line="240" w:lineRule="auto"/>
         <w:jc w:val="center"/>
+        <w:rPr>
+          <w:rFonts w:ascii="Inter" w:hAnsi="Inter"/>
+          <w:sz w:val="18"/>
+          <w:szCs w:val="18"/>
+        </w:rPr>
       </w:pPr>
-      <w:r/>
       <w:r>
         <w:rPr>
-          <w:rFonts w:ascii="Calibri" w:hAnsi="Calibri"/>
+          <w:rFonts w:ascii="Inter" w:hAnsi="Inter"/>
           <w:b/>
-          <w:i w:val="0"/>
           <w:color w:val="0C4E2D"/>
-          <w:sz w:val="22"/>
+          <w:sz w:val="18"/>
+          <w:szCs w:val="18"/>
         </w:rPr>
         <w:t>CENTRAL LUZON STATE UNIVERSITY</w:t>
+      </w:r>
+      <w:r>
+        <w:rPr>
+          <w:rFonts w:ascii="Inter" w:hAnsi="Inter"/>
+          <w:b/>
+          <w:color w:val="0C4E2D"/>
+          <w:sz w:val="18"/>
+          <w:szCs w:val="18"/>
+        </w:rPr>
         <w:br/>
       </w:r>
       <w:r>
         <w:rPr>
-          <w:rFonts w:ascii="Calibri" w:hAnsi="Calibri"/>
+          <w:rFonts w:ascii="Inter" w:hAnsi="Inter"/>
           <w:b/>
-          <w:i w:val="0"/>
           <w:color w:val="505050"/>
-          <w:sz w:val="19"/>
+          <w:sz w:val="18"/>
+          <w:szCs w:val="18"/>
         </w:rPr>
         <w:t>College of Engineering • Department of Information Technology</w:t>
+      </w:r>
+      <w:r>
+        <w:rPr>
+          <w:rFonts w:ascii="Inter" w:hAnsi="Inter"/>
+          <w:b/>
+          <w:color w:val="505050"/>
+          <w:sz w:val="18"/>
+          <w:szCs w:val="18"/>
+        </w:rPr>
         <w:br/>
       </w:r>
       <w:r>
         <w:rPr>
-          <w:rFonts w:ascii="Calibri" w:hAnsi="Calibri"/>
-          <w:b w:val="0"/>
+          <w:rFonts w:ascii="Inter" w:hAnsi="Inter"/>
           <w:i/>
           <w:color w:val="646464"/>
-          <w:sz w:val="17"/>
+          <w:sz w:val="16"/>
+          <w:szCs w:val="16"/>
         </w:rPr>
         <w:t>Science City of Muñoz, Nueva Ecija, Philippines</w:t>
-        <w:br/>
+      </w:r>
+      <w:r>
+        <w:rPr>
+          <w:rFonts w:ascii="Inter" w:hAnsi="Inter"/>
+          <w:i/>
+          <w:color w:val="646464"/>
+          <w:sz w:val="18"/>
+          <w:szCs w:val="18"/>
+        </w:rPr>
         <w:br/>
       </w:r>
       <w:r>
         <w:rPr>
-          <w:rFonts w:ascii="Calibri" w:hAnsi="Calibri"/>
+          <w:rFonts w:ascii="Inter" w:hAnsi="Inter"/>
           <w:b/>
-          <w:i w:val="0"/>
           <w:color w:val="0C4E2D"/>
-          <w:sz w:val="26"/>
+          <w:sz w:val="18"/>
+          <w:szCs w:val="18"/>
         </w:rPr>
         <w:t>RESEARCH PARTICIPANT INTERVIEW CONSENT FORM</w:t>
       </w:r>
     </w:p>
     <w:p>
       <w:pPr>
-        <w:spacing w:after="200"/>
+        <w:spacing w:line="240" w:lineRule="auto"/>
         <w:jc w:val="center"/>
+        <w:rPr>
+          <w:rFonts w:ascii="Inter" w:hAnsi="Inter"/>
+          <w:sz w:val="16"/>
+          <w:szCs w:val="16"/>
+        </w:rPr>
       </w:pPr>
-      <w:r/>
       <w:r>
         <w:rPr>
-          <w:rFonts w:ascii="Calibri" w:hAnsi="Calibri"/>
-          <w:b w:val="0"/>
+          <w:rFonts w:ascii="Inter" w:hAnsi="Inter"/>
           <w:i/>
           <w:color w:val="505050"/>
-          <w:sz w:val="20"/>
+          <w:sz w:val="16"/>
+          <w:szCs w:val="16"/>
         </w:rPr>
-        <w:t>For Academic Capstone Research Data Gathering &amp; User Experience Evaluation</w:t>
+        <w:t xml:space="preserve">For Academic Capstone Research Data Gathering &amp; User </w:t>
+      </w:r>
+      <w:r>
+        <w:rPr>
+          <w:rFonts w:ascii="Inter" w:hAnsi="Inter"/>
+          <w:i/>
+          <w:color w:val="505050"/>
+          <w:sz w:val="16"/>
+          <w:szCs w:val="16"/>
+        </w:rPr>
+        <w:t>Experience Evaluation</w:t>
       </w:r>
     </w:p>
     <w:tbl>
@@ -101,20 +145,18 @@
           <w:p>
             <w:pPr>
               <w:spacing w:before="40" w:after="40" w:line="276" w:lineRule="auto"/>
-              <w:jc w:val="left"/>
+              <w:rPr>
+                <w:rFonts w:ascii="Inter" w:hAnsi="Inter"/>
+                <w:sz w:val="18"/>
+                <w:szCs w:val="18"/>
+              </w:rPr>
             </w:pPr>
             <w:r>
               <w:rPr>
-                <w:b/>
-              </w:rPr>
-            </w:r>
-            <w:r>
-              <w:rPr>
-                <w:rFonts w:ascii="Calibri" w:hAnsi="Calibri"/>
-                <w:b w:val="0"/>
-                <w:i w:val="0"/>
+                <w:rFonts w:ascii="Inter" w:hAnsi="Inter"/>
                 <w:color w:val="000000"/>
-                <w:sz w:val="19"/>
+                <w:sz w:val="18"/>
+                <w:szCs w:val="18"/>
               </w:rPr>
               <w:t>Research Title</w:t>
             </w:r>
@@ -132,7 +174,20 @@
             <w:vAlign w:val="center"/>
           </w:tcPr>
           <w:p>
+            <w:pPr>
+              <w:jc w:val="both"/>
+              <w:rPr>
+                <w:rFonts w:ascii="Inter" w:hAnsi="Inter"/>
+                <w:sz w:val="18"/>
+                <w:szCs w:val="18"/>
+              </w:rPr>
+            </w:pPr>
             <w:r>
+              <w:rPr>
+                <w:rFonts w:ascii="Inter" w:hAnsi="Inter"/>
+                <w:sz w:val="18"/>
+                <w:szCs w:val="18"/>
+              </w:rPr>
               <w:t>A.E.G.I.S: AI-ENHANCED GRANT INFORMATION SYSTEM WITH DOCUMENT FORENSICS AND AUTOMATED NOTIFICATION FOR THE OFFICE OF STUDENT AFFAIRS</w:t>
             </w:r>
           </w:p>
@@ -157,20 +212,18 @@
           <w:p>
             <w:pPr>
               <w:spacing w:before="40" w:after="40" w:line="276" w:lineRule="auto"/>
-              <w:jc w:val="left"/>
+              <w:rPr>
+                <w:rFonts w:ascii="Inter" w:hAnsi="Inter"/>
+                <w:sz w:val="18"/>
+                <w:szCs w:val="18"/>
+              </w:rPr>
             </w:pPr>
             <w:r>
               <w:rPr>
-                <w:b/>
-              </w:rPr>
-            </w:r>
-            <w:r>
-              <w:rPr>
-                <w:rFonts w:ascii="Calibri" w:hAnsi="Calibri"/>
-                <w:b w:val="0"/>
-                <w:i w:val="0"/>
+                <w:rFonts w:ascii="Inter" w:hAnsi="Inter"/>
                 <w:color w:val="000000"/>
-                <w:sz w:val="19"/>
+                <w:sz w:val="18"/>
+                <w:szCs w:val="18"/>
               </w:rPr>
               <w:t>Short Description / Abstract</w:t>
             </w:r>
@@ -188,8 +241,45 @@
             <w:vAlign w:val="center"/>
           </w:tcPr>
           <w:p>
+            <w:pPr>
+              <w:jc w:val="both"/>
+              <w:rPr>
+                <w:rFonts w:ascii="Inter" w:hAnsi="Inter"/>
+                <w:sz w:val="18"/>
+                <w:szCs w:val="18"/>
+              </w:rPr>
+            </w:pPr>
             <w:r>
-              <w:t>A web-based scholarship management and document forensics portal developed for the Central Luzon State University - Office of Student Affairs (CLSU OSA). The system features a centralized scholarship application workflow, an AI-based Certificate of Grades (COG) document verification module utilizing Error Level Analysis (ELA) at Q=95 and a Convolutional Neural Network (ResNet-50) with Grad-CAM heatmap visualization to compute a Fraud Probability Score (FPS), an automated SMTP email and in-app notification engine, and a centralized compliance record export module supporting CSV and PDF formats for CHED StuFAPs and DOST-SEI reporting.</w:t>
+              <w:rPr>
+                <w:rFonts w:ascii="Inter" w:hAnsi="Inter"/>
+                <w:sz w:val="18"/>
+                <w:szCs w:val="18"/>
+              </w:rPr>
+              <w:t>A web-based scholarship management and document forensic</w:t>
+            </w:r>
+            <w:r>
+              <w:rPr>
+                <w:rFonts w:ascii="Inter" w:hAnsi="Inter"/>
+                <w:sz w:val="18"/>
+                <w:szCs w:val="18"/>
+              </w:rPr>
+              <w:t>s portal developed for the Central Luzon State University - Office of Student Affairs (CLSU OSA). The system features a centralized scholarship application workflow, an AI-based Certificate of Grades (COG) document verification module utilizing Error Level</w:t>
+            </w:r>
+            <w:r>
+              <w:rPr>
+                <w:rFonts w:ascii="Inter" w:hAnsi="Inter"/>
+                <w:sz w:val="18"/>
+                <w:szCs w:val="18"/>
+              </w:rPr>
+              <w:t xml:space="preserve"> Analysis (ELA) at Q=95 and a Convolutional Neural Network (ResNet-50) with Grad-CAM heatmap visualization to compute a Fraud Probability Score (FPS), an automated SMTP email and in-app notification engine, and a centralized compliance record export module</w:t>
+            </w:r>
+            <w:r>
+              <w:rPr>
+                <w:rFonts w:ascii="Inter" w:hAnsi="Inter"/>
+                <w:sz w:val="18"/>
+                <w:szCs w:val="18"/>
+              </w:rPr>
+              <w:t xml:space="preserve"> supporting CSV and PDF formats for CHED StuFAPs and DOST-SEI reporting.</w:t>
             </w:r>
           </w:p>
         </w:tc>
@@ -213,20 +303,18 @@
           <w:p>
             <w:pPr>
               <w:spacing w:before="40" w:after="40" w:line="276" w:lineRule="auto"/>
-              <w:jc w:val="left"/>
+              <w:rPr>
+                <w:rFonts w:ascii="Inter" w:hAnsi="Inter"/>
+                <w:sz w:val="18"/>
+                <w:szCs w:val="18"/>
+              </w:rPr>
             </w:pPr>
             <w:r>
               <w:rPr>
-                <w:b/>
-              </w:rPr>
-            </w:r>
-            <w:r>
-              <w:rPr>
-                <w:rFonts w:ascii="Calibri" w:hAnsi="Calibri"/>
-                <w:b w:val="0"/>
-                <w:i w:val="0"/>
+                <w:rFonts w:ascii="Inter" w:hAnsi="Inter"/>
                 <w:color w:val="000000"/>
-                <w:sz w:val="19"/>
+                <w:sz w:val="18"/>
+                <w:szCs w:val="18"/>
               </w:rPr>
               <w:t>Researcher/s Name</w:t>
             </w:r>
@@ -244,7 +332,20 @@
             <w:vAlign w:val="center"/>
           </w:tcPr>
           <w:p>
+            <w:pPr>
+              <w:jc w:val="both"/>
+              <w:rPr>
+                <w:rFonts w:ascii="Inter" w:hAnsi="Inter"/>
+                <w:sz w:val="18"/>
+                <w:szCs w:val="18"/>
+              </w:rPr>
+            </w:pPr>
             <w:r>
+              <w:rPr>
+                <w:rFonts w:ascii="Inter" w:hAnsi="Inter"/>
+                <w:sz w:val="18"/>
+                <w:szCs w:val="18"/>
+              </w:rPr>
               <w:t>John Andrei Carillo, Noriel S. Gadiano, Joshua A. Razon</w:t>
             </w:r>
           </w:p>
@@ -269,20 +370,18 @@
           <w:p>
             <w:pPr>
               <w:spacing w:before="40" w:after="40" w:line="276" w:lineRule="auto"/>
-              <w:jc w:val="left"/>
+              <w:rPr>
+                <w:rFonts w:ascii="Inter" w:hAnsi="Inter"/>
+                <w:sz w:val="18"/>
+                <w:szCs w:val="18"/>
+              </w:rPr>
             </w:pPr>
             <w:r>
               <w:rPr>
-                <w:b/>
-              </w:rPr>
-            </w:r>
-            <w:r>
-              <w:rPr>
-                <w:rFonts w:ascii="Calibri" w:hAnsi="Calibri"/>
-                <w:b w:val="0"/>
-                <w:i w:val="0"/>
+                <w:rFonts w:ascii="Inter" w:hAnsi="Inter"/>
                 <w:color w:val="000000"/>
-                <w:sz w:val="19"/>
+                <w:sz w:val="18"/>
+                <w:szCs w:val="18"/>
               </w:rPr>
               <w:t>Course / Year / Section</w:t>
             </w:r>
@@ -302,16 +401,19 @@
           <w:p>
             <w:pPr>
               <w:spacing w:before="40" w:after="40" w:line="276" w:lineRule="auto"/>
-              <w:jc w:val="left"/>
+              <w:jc w:val="both"/>
+              <w:rPr>
+                <w:rFonts w:ascii="Inter" w:hAnsi="Inter"/>
+                <w:sz w:val="18"/>
+                <w:szCs w:val="18"/>
+              </w:rPr>
             </w:pPr>
-            <w:r/>
             <w:r>
               <w:rPr>
-                <w:rFonts w:ascii="Calibri" w:hAnsi="Calibri"/>
-                <w:b w:val="0"/>
-                <w:i w:val="0"/>
+                <w:rFonts w:ascii="Inter" w:hAnsi="Inter"/>
                 <w:color w:val="000000"/>
-                <w:sz w:val="19"/>
+                <w:sz w:val="18"/>
+                <w:szCs w:val="18"/>
               </w:rPr>
               <w:t>Bachelor of Science in Information Technology (BSIT) 4-1</w:t>
             </w:r>
@@ -322,56 +424,178 @@
     <w:p>
       <w:pPr>
         <w:spacing w:before="140" w:after="100" w:line="240" w:lineRule="auto"/>
+        <w:ind w:firstLine="720"/>
         <w:jc w:val="both"/>
+        <w:rPr>
+          <w:rFonts w:ascii="Inter" w:hAnsi="Inter"/>
+          <w:sz w:val="18"/>
+          <w:szCs w:val="18"/>
+        </w:rPr>
       </w:pPr>
       <w:r>
-        <w:t>We, the researchers, are conducting the study identified above for academic purposes. You are invited to participate in this study, which may involve an interview and, only if you agree, may include audio recording, video recording, and/or photographs during the data collection process.</w:t>
+        <w:rPr>
+          <w:rFonts w:ascii="Inter" w:hAnsi="Inter"/>
+          <w:sz w:val="18"/>
+          <w:szCs w:val="18"/>
+        </w:rPr>
+        <w:t xml:space="preserve">We, the researchers, are </w:t>
+      </w:r>
+      <w:r>
+        <w:rPr>
+          <w:rFonts w:ascii="Inter" w:hAnsi="Inter"/>
+          <w:sz w:val="18"/>
+          <w:szCs w:val="18"/>
+        </w:rPr>
+        <w:t>conducting the study identified above for academic purposes. You are invited to participate in this study, which may involve an interview and, only if you agree, may include audio recording, video recording, and/or photographs during the data collection pr</w:t>
+      </w:r>
+      <w:r>
+        <w:rPr>
+          <w:rFonts w:ascii="Inter" w:hAnsi="Inter"/>
+          <w:sz w:val="18"/>
+          <w:szCs w:val="18"/>
+        </w:rPr>
+        <w:t>ocess.</w:t>
+      </w:r>
+      <w:r>
+        <w:rPr>
+          <w:rFonts w:ascii="Inter" w:hAnsi="Inter"/>
+          <w:sz w:val="18"/>
+          <w:szCs w:val="18"/>
+        </w:rPr>
+        <w:t xml:space="preserve"> </w:t>
+      </w:r>
+      <w:r>
+        <w:rPr>
+          <w:rFonts w:ascii="Inter" w:hAnsi="Inter"/>
+          <w:sz w:val="18"/>
+          <w:szCs w:val="18"/>
+        </w:rPr>
+        <w:t xml:space="preserve">Any recordings, photographs, and personal information collected will be used only for purposes directly related to this study, including data analysis, documentation, and academic reporting. Your personal information and research data will be </w:t>
+      </w:r>
+      <w:r>
+        <w:rPr>
+          <w:rFonts w:ascii="Inter" w:hAnsi="Inter"/>
+          <w:sz w:val="18"/>
+          <w:szCs w:val="18"/>
+        </w:rPr>
+        <w:t>kept secure and confidential and will be accessed only by authorized members of the research team. Information that could directly identify you will not be disclosed to unauthorized persons.</w:t>
       </w:r>
     </w:p>
     <w:p>
       <w:pPr>
         <w:spacing w:after="100" w:line="240" w:lineRule="auto"/>
+        <w:ind w:firstLine="720"/>
         <w:jc w:val="both"/>
+        <w:rPr>
+          <w:rFonts w:ascii="Inter" w:hAnsi="Inter"/>
+          <w:sz w:val="18"/>
+          <w:szCs w:val="18"/>
+        </w:rPr>
       </w:pPr>
       <w:r>
-        <w:t>Any recordings, photographs, and personal information collected will be used only for purposes directly related to this study, including data analysis, documentation, and academic reporting. Your personal information and research data will be kept secure and confidential and will be accessed only by authorized members of the research team. Information that could directly identify you will not be disclosed to unauthorized persons.</w:t>
+        <w:rPr>
+          <w:rFonts w:ascii="Inter" w:hAnsi="Inter"/>
+          <w:sz w:val="18"/>
+          <w:szCs w:val="18"/>
+        </w:rPr>
+        <w:t>The research team will retain the collected data only for as long</w:t>
+      </w:r>
+      <w:r>
+        <w:rPr>
+          <w:rFonts w:ascii="Inter" w:hAnsi="Inter"/>
+          <w:sz w:val="18"/>
+          <w:szCs w:val="18"/>
+        </w:rPr>
+        <w:t xml:space="preserve"> as necessary to complete the study, its required academic reports, and any related evaluation or validation. After these purposes have been completed, identifiable records, recordings, and photographs will be securely deleted or disposed of, unless a long</w:t>
+      </w:r>
+      <w:r>
+        <w:rPr>
+          <w:rFonts w:ascii="Inter" w:hAnsi="Inter"/>
+          <w:sz w:val="18"/>
+          <w:szCs w:val="18"/>
+        </w:rPr>
+        <w:t>er retention period is specifically required by the school, research adviser, ethics review process, or applicable law and has been properly communicated to you.</w:t>
       </w:r>
     </w:p>
     <w:p>
       <w:pPr>
         <w:spacing w:after="100" w:line="240" w:lineRule="auto"/>
+        <w:ind w:firstLine="720"/>
         <w:jc w:val="both"/>
+        <w:rPr>
+          <w:rFonts w:ascii="Inter" w:hAnsi="Inter"/>
+          <w:sz w:val="18"/>
+          <w:szCs w:val="18"/>
+        </w:rPr>
       </w:pPr>
       <w:r>
-        <w:t>The research team will retain the collected data only for as long as necessary to complete the study, its required academic reports, and any related evaluation or validation. After these purposes have been completed, identifiable records, recordings, and photographs will be securely deleted or disposed of, unless a longer retention period is specifically required by the school, research adviser, ethics review process, or applicable law and has been properly communicated to you.</w:t>
+        <w:rPr>
+          <w:rFonts w:ascii="Inter" w:hAnsi="Inter"/>
+          <w:sz w:val="18"/>
+          <w:szCs w:val="18"/>
+        </w:rPr>
+        <w:t>Your information will be handled in accordance with the Data Privacy Act of 2012 (Republic Act</w:t>
       </w:r>
-    </w:p>
-    <w:p>
-      <w:pPr>
-        <w:spacing w:after="100" w:line="240" w:lineRule="auto"/>
-        <w:jc w:val="both"/>
-      </w:pPr>
       <w:r>
-        <w:t>Your information will be handled in accordance with the Data Privacy Act of 2012 (Republic Act No. 10173) and its Implementing Rules and Regulations. As a data subject, you have the right to be informed, to access your personal data, to object to processing when applicable, to request correction or deletion where appropriate, and to withdraw your consent, subject to applicable laws and legitimate research requirements.</w:t>
+        <w:rPr>
+          <w:rFonts w:ascii="Inter" w:hAnsi="Inter"/>
+          <w:sz w:val="18"/>
+          <w:szCs w:val="18"/>
+        </w:rPr>
+        <w:t xml:space="preserve"> No. 10173) and its Implementing Rules and Regulations. As a data subject, you have the right to be informed, to access your personal data, to object to processing when applicable, to request correction or deletion where appropriate, and to withdraw your c</w:t>
+      </w:r>
+      <w:r>
+        <w:rPr>
+          <w:rFonts w:ascii="Inter" w:hAnsi="Inter"/>
+          <w:sz w:val="18"/>
+          <w:szCs w:val="18"/>
+        </w:rPr>
+        <w:t>onsent, subject to applicable laws and legitimate research requirements.</w:t>
       </w:r>
     </w:p>
     <w:p>
       <w:pPr>
         <w:spacing w:after="120" w:line="240" w:lineRule="auto"/>
+        <w:ind w:firstLine="720"/>
         <w:jc w:val="both"/>
+        <w:rPr>
+          <w:rFonts w:ascii="Inter" w:hAnsi="Inter"/>
+          <w:sz w:val="18"/>
+          <w:szCs w:val="18"/>
+        </w:rPr>
       </w:pPr>
       <w:r>
-        <w:t>Your participation is entirely voluntary. You may refuse to participate or withdraw from the study at any time without penalty or negative consequences. Declining any form of recording or photography will not, by itself, prevent you from participating in the interview if the researchers can proceed without it.</w:t>
+        <w:rPr>
+          <w:rFonts w:ascii="Inter" w:hAnsi="Inter"/>
+          <w:sz w:val="18"/>
+          <w:szCs w:val="18"/>
+        </w:rPr>
+        <w:t>Your participation is entirely voluntary. You may refuse to participate or withdraw from the study at any time without penalty or negative consequences. Declining any form of recordin</w:t>
+      </w:r>
+      <w:r>
+        <w:rPr>
+          <w:rFonts w:ascii="Inter" w:hAnsi="Inter"/>
+          <w:sz w:val="18"/>
+          <w:szCs w:val="18"/>
+        </w:rPr>
+        <w:t>g or photography will not, by itself, prevent you from participating in the interview if the researchers can proceed without it.</w:t>
       </w:r>
     </w:p>
     <w:p>
       <w:pPr>
         <w:spacing w:before="40" w:after="60"/>
+        <w:rPr>
+          <w:rFonts w:ascii="Inter" w:hAnsi="Inter"/>
+          <w:sz w:val="18"/>
+          <w:szCs w:val="18"/>
+        </w:rPr>
       </w:pPr>
       <w:r>
         <w:rPr>
+          <w:rFonts w:ascii="Inter" w:hAnsi="Inter"/>
           <w:b/>
-          <w:sz w:val="22"/>
+          <w:sz w:val="18"/>
+          <w:szCs w:val="18"/>
         </w:rPr>
         <w:t>PARTICIPATION AND RECORDING CONSENT</w:t>
       </w:r>
@@ -379,10 +603,17 @@
     <w:p>
       <w:pPr>
         <w:spacing w:after="60"/>
+        <w:rPr>
+          <w:rFonts w:ascii="Inter" w:hAnsi="Inter"/>
+          <w:sz w:val="18"/>
+          <w:szCs w:val="18"/>
+        </w:rPr>
       </w:pPr>
       <w:r>
         <w:rPr>
-          <w:sz w:val="20"/>
+          <w:rFonts w:ascii="Inter" w:hAnsi="Inter"/>
+          <w:sz w:val="18"/>
+          <w:szCs w:val="18"/>
         </w:rPr>
         <w:t>Please place a check mark (✓) beside each option that reflects your decision:</w:t>
       </w:r>
@@ -391,71 +622,188 @@
       <w:pPr>
         <w:spacing w:after="30"/>
         <w:ind w:left="115"/>
+        <w:rPr>
+          <w:rFonts w:ascii="Inter" w:hAnsi="Inter"/>
+          <w:sz w:val="18"/>
+          <w:szCs w:val="18"/>
+        </w:rPr>
       </w:pPr>
       <w:r>
         <w:rPr>
-          <w:sz w:val="20"/>
+          <w:rFonts w:ascii="Segoe UI Symbol" w:hAnsi="Segoe UI Symbol" w:cs="Segoe UI Symbol"/>
+          <w:sz w:val="18"/>
+          <w:szCs w:val="18"/>
         </w:rPr>
-        <w:t>☐ I voluntarily agree to participate in this research interview.</w:t>
+        <w:t>☐</w:t>
+      </w:r>
+      <w:r>
+        <w:rPr>
+          <w:rFonts w:ascii="Inter" w:hAnsi="Inter"/>
+          <w:sz w:val="18"/>
+          <w:szCs w:val="18"/>
+        </w:rPr>
+        <w:t xml:space="preserve"> I voluntari</w:t>
+      </w:r>
+      <w:r>
+        <w:rPr>
+          <w:rFonts w:ascii="Inter" w:hAnsi="Inter"/>
+          <w:sz w:val="18"/>
+          <w:szCs w:val="18"/>
+        </w:rPr>
+        <w:t>ly agree to participate in this research interview.</w:t>
+      </w:r>
+    </w:p>
+    <w:p>
+      <w:pPr>
+        <w:tabs>
+          <w:tab w:val="left" w:pos="5685"/>
+        </w:tabs>
+        <w:spacing w:after="30"/>
+        <w:ind w:left="115"/>
+        <w:rPr>
+          <w:rFonts w:ascii="Inter" w:hAnsi="Inter"/>
+          <w:sz w:val="18"/>
+          <w:szCs w:val="18"/>
+        </w:rPr>
+      </w:pPr>
+      <w:r>
+        <w:rPr>
+          <w:rFonts w:ascii="Segoe UI Symbol" w:hAnsi="Segoe UI Symbol" w:cs="Segoe UI Symbol"/>
+          <w:sz w:val="18"/>
+          <w:szCs w:val="18"/>
+        </w:rPr>
+        <w:t>☐</w:t>
+      </w:r>
+      <w:r>
+        <w:rPr>
+          <w:rFonts w:ascii="Inter" w:hAnsi="Inter"/>
+          <w:sz w:val="18"/>
+          <w:szCs w:val="18"/>
+        </w:rPr>
+        <w:t xml:space="preserve"> I consent to audio recording during the interview.</w:t>
+      </w:r>
+      <w:r>
+        <w:rPr>
+          <w:rFonts w:ascii="Inter" w:hAnsi="Inter"/>
+          <w:sz w:val="18"/>
+          <w:szCs w:val="18"/>
+        </w:rPr>
+        <w:tab/>
       </w:r>
     </w:p>
     <w:p>
       <w:pPr>
         <w:spacing w:after="30"/>
         <w:ind w:left="115"/>
+        <w:rPr>
+          <w:rFonts w:ascii="Inter" w:hAnsi="Inter"/>
+          <w:sz w:val="18"/>
+          <w:szCs w:val="18"/>
+        </w:rPr>
       </w:pPr>
       <w:r>
         <w:rPr>
-          <w:sz w:val="20"/>
+          <w:rFonts w:ascii="Segoe UI Symbol" w:hAnsi="Segoe UI Symbol" w:cs="Segoe UI Symbol"/>
+          <w:sz w:val="18"/>
+          <w:szCs w:val="18"/>
         </w:rPr>
-        <w:t>☐ I consent to audio recording during the interview.</w:t>
+        <w:t>☐</w:t>
+      </w:r>
+      <w:r>
+        <w:rPr>
+          <w:rFonts w:ascii="Inter" w:hAnsi="Inter"/>
+          <w:sz w:val="18"/>
+          <w:szCs w:val="18"/>
+        </w:rPr>
+        <w:t xml:space="preserve"> I consent to video recording during the interview.</w:t>
       </w:r>
     </w:p>
     <w:p>
       <w:pPr>
         <w:spacing w:after="30"/>
         <w:ind w:left="115"/>
+        <w:rPr>
+          <w:rFonts w:ascii="Inter" w:hAnsi="Inter"/>
+          <w:sz w:val="18"/>
+          <w:szCs w:val="18"/>
+        </w:rPr>
       </w:pPr>
       <w:r>
         <w:rPr>
-          <w:sz w:val="20"/>
+          <w:rFonts w:ascii="Segoe UI Symbol" w:hAnsi="Segoe UI Symbol" w:cs="Segoe UI Symbol"/>
+          <w:sz w:val="18"/>
+          <w:szCs w:val="18"/>
         </w:rPr>
-        <w:t>☐ I consent to video recording during the interview.</w:t>
+        <w:t>☐</w:t>
+      </w:r>
+      <w:r>
+        <w:rPr>
+          <w:rFonts w:ascii="Inter" w:hAnsi="Inter"/>
+          <w:sz w:val="18"/>
+          <w:szCs w:val="18"/>
+        </w:rPr>
+        <w:t xml:space="preserve"> I consent to photographs being taken during the interview.</w:t>
       </w:r>
     </w:p>
     <w:p>
       <w:pPr>
         <w:spacing w:after="30"/>
         <w:ind w:left="115"/>
+        <w:rPr>
+          <w:rFonts w:ascii="Inter" w:hAnsi="Inter"/>
+          <w:sz w:val="18"/>
+          <w:szCs w:val="18"/>
+        </w:rPr>
       </w:pPr>
       <w:r>
         <w:rPr>
-          <w:sz w:val="20"/>
+          <w:rFonts w:ascii="Segoe UI Symbol" w:hAnsi="Segoe UI Symbol" w:cs="Segoe UI Symbol"/>
+          <w:sz w:val="18"/>
+          <w:szCs w:val="18"/>
         </w:rPr>
-        <w:t>☐ I consent to photographs being taken during the interview.</w:t>
+        <w:t>☐</w:t>
       </w:r>
-    </w:p>
-    <w:p>
-      <w:pPr>
-        <w:spacing w:after="30"/>
-        <w:ind w:left="115"/>
-      </w:pPr>
       <w:r>
         <w:rPr>
-          <w:sz w:val="20"/>
+          <w:rFonts w:ascii="Inter" w:hAnsi="Inter"/>
+          <w:sz w:val="18"/>
+          <w:szCs w:val="18"/>
         </w:rPr>
-        <w:t>☐ I do not consent to any audio/video recording or photographs.</w:t>
+        <w:t xml:space="preserve"> I do not consent to any audio/video</w:t>
+      </w:r>
+      <w:r>
+        <w:rPr>
+          <w:rFonts w:ascii="Inter" w:hAnsi="Inter"/>
+          <w:sz w:val="18"/>
+          <w:szCs w:val="18"/>
+        </w:rPr>
+        <w:t xml:space="preserve"> recording or photographs.</w:t>
       </w:r>
     </w:p>
     <w:p>
       <w:pPr>
         <w:spacing w:before="80" w:after="80"/>
+        <w:rPr>
+          <w:rFonts w:ascii="Inter" w:hAnsi="Inter"/>
+          <w:sz w:val="18"/>
+          <w:szCs w:val="18"/>
+        </w:rPr>
       </w:pPr>
       <w:r>
         <w:rPr>
-          <w:sz w:val="20"/>
+          <w:rFonts w:ascii="Inter" w:hAnsi="Inter"/>
+          <w:sz w:val="18"/>
+          <w:szCs w:val="18"/>
         </w:rPr>
-        <w:t>By signing below, I confirm that I have been informed about the nature and purpose of the study, understand my rights as a data subject, have had the opportunity to ask questions, and voluntarily agree to participate according to the choices indicated above.</w:t>
+        <w:t>By signing below, I confirm that I have been informed about the nature and purpose of the study, understand my rights as a data subject, have had the opportunity to ask questions, and voluntarily agree to participate according to</w:t>
+      </w:r>
+      <w:r>
+        <w:rPr>
+          <w:rFonts w:ascii="Inter" w:hAnsi="Inter"/>
+          <w:sz w:val="18"/>
+          <w:szCs w:val="18"/>
+        </w:rPr>
+        <w:t xml:space="preserve"> the choices indicated above.</w:t>
       </w:r>
     </w:p>
     <w:tbl>
@@ -487,10 +835,17 @@
           <w:p>
             <w:pPr>
               <w:spacing w:after="180"/>
+              <w:rPr>
+                <w:rFonts w:ascii="Inter" w:hAnsi="Inter"/>
+                <w:sz w:val="18"/>
+                <w:szCs w:val="18"/>
+              </w:rPr>
             </w:pPr>
             <w:r>
               <w:rPr>
+                <w:rFonts w:ascii="Inter" w:hAnsi="Inter"/>
                 <w:sz w:val="18"/>
+                <w:szCs w:val="18"/>
               </w:rPr>
               <w:t>Participant’s Signature over Printed Name</w:t>
             </w:r>
@@ -510,10 +865,17 @@
           <w:p>
             <w:pPr>
               <w:spacing w:after="180"/>
+              <w:rPr>
+                <w:rFonts w:ascii="Inter" w:hAnsi="Inter"/>
+                <w:sz w:val="18"/>
+                <w:szCs w:val="18"/>
+              </w:rPr>
             </w:pPr>
             <w:r>
               <w:rPr>
+                <w:rFonts w:ascii="Inter" w:hAnsi="Inter"/>
                 <w:sz w:val="18"/>
+                <w:szCs w:val="18"/>
               </w:rPr>
               <w:t>Date</w:t>
             </w:r>
@@ -538,10 +900,17 @@
           <w:p>
             <w:pPr>
               <w:spacing w:after="180"/>
+              <w:rPr>
+                <w:rFonts w:ascii="Inter" w:hAnsi="Inter"/>
+                <w:sz w:val="18"/>
+                <w:szCs w:val="18"/>
+              </w:rPr>
             </w:pPr>
             <w:r>
               <w:rPr>
+                <w:rFonts w:ascii="Inter" w:hAnsi="Inter"/>
                 <w:sz w:val="18"/>
+                <w:szCs w:val="18"/>
               </w:rPr>
               <w:t>Position / Role (if applicable)</w:t>
             </w:r>
@@ -561,10 +930,17 @@
           <w:p>
             <w:pPr>
               <w:spacing w:after="180"/>
+              <w:rPr>
+                <w:rFonts w:ascii="Inter" w:hAnsi="Inter"/>
+                <w:sz w:val="18"/>
+                <w:szCs w:val="18"/>
+              </w:rPr>
             </w:pPr>
             <w:r>
               <w:rPr>
+                <w:rFonts w:ascii="Inter" w:hAnsi="Inter"/>
                 <w:sz w:val="18"/>
+                <w:szCs w:val="18"/>
               </w:rPr>
               <w:t>Organization / Company (if applicable)</w:t>
             </w:r>
@@ -590,12 +966,27 @@
           <w:p>
             <w:pPr>
               <w:spacing w:after="180"/>
+              <w:rPr>
+                <w:rFonts w:ascii="Inter" w:hAnsi="Inter"/>
+                <w:sz w:val="18"/>
+                <w:szCs w:val="18"/>
+              </w:rPr>
             </w:pPr>
             <w:r>
               <w:rPr>
+                <w:rFonts w:ascii="Inter" w:hAnsi="Inter"/>
                 <w:sz w:val="18"/>
+                <w:szCs w:val="18"/>
               </w:rPr>
-              <w:t>Participant Contact Information (optional, if needed for research follow-up): ______________________________</w:t>
+              <w:t xml:space="preserve">Participant Contact Information (optional, if needed for research follow-up): </w:t>
+            </w:r>
+            <w:r>
+              <w:rPr>
+                <w:rFonts w:ascii="Inter" w:hAnsi="Inter"/>
+                <w:sz w:val="18"/>
+                <w:szCs w:val="18"/>
+              </w:rPr>
+              <w:t>______________________________</w:t>
             </w:r>
           </w:p>
         </w:tc>
@@ -617,8 +1008,38 @@
             <w:vAlign w:val="center"/>
           </w:tcPr>
           <w:p>
+            <w:pPr>
+              <w:rPr>
+                <w:rFonts w:ascii="Inter" w:hAnsi="Inter"/>
+                <w:sz w:val="16"/>
+                <w:szCs w:val="16"/>
+              </w:rPr>
+            </w:pPr>
             <w:r>
-              <w:t>Researcher Contact / Email:  johnandrei.carillo@clsu2.edu.ph  |  noriel.gadiano@clsu2.edu.ph  |  joshua.razon@clsu2.edu.ph</w:t>
+              <w:rPr>
+                <w:rFonts w:ascii="Inter" w:hAnsi="Inter"/>
+                <w:sz w:val="16"/>
+                <w:szCs w:val="16"/>
+              </w:rPr>
+              <w:t xml:space="preserve">Researcher Contact / Email:  </w:t>
+            </w:r>
+            <w:proofErr w:type="gramStart"/>
+            <w:r>
+              <w:rPr>
+                <w:rFonts w:ascii="Inter" w:hAnsi="Inter"/>
+                <w:sz w:val="16"/>
+                <w:szCs w:val="16"/>
+              </w:rPr>
+              <w:t>johnandrei.carillo@clsu2.edu.ph  |</w:t>
+            </w:r>
+            <w:proofErr w:type="gramEnd"/>
+            <w:r>
+              <w:rPr>
+                <w:rFonts w:ascii="Inter" w:hAnsi="Inter"/>
+                <w:sz w:val="16"/>
+                <w:szCs w:val="16"/>
+              </w:rPr>
+              <w:t xml:space="preserve">  noriel.gadiano@clsu2.edu.ph  |  joshua.razon@clsu2.edu.ph</w:t>
             </w:r>
           </w:p>
         </w:tc>
@@ -627,20 +1048,17 @@
     <w:p>
       <w:pPr>
         <w:spacing w:before="120" w:after="0"/>
-        <w:jc w:val="center"/>
+        <w:rPr>
+          <w:rFonts w:ascii="Inter" w:hAnsi="Inter"/>
+          <w:sz w:val="16"/>
+          <w:szCs w:val="16"/>
+        </w:rPr>
       </w:pPr>
-      <w:r>
-        <w:rPr>
-          <w:i/>
-          <w:sz w:val="17"/>
-        </w:rPr>
-        <w:t>Keep one copy of this form with the research records. Provide a copy to the participant upon request.</w:t>
-      </w:r>
     </w:p>
     <w:sectPr>
       <w:footerReference w:type="default" r:id="rId8"/>
-      <w:pgSz w:w="12240" w:h="15840"/>
-      <w:pgMar w:top="792" w:right="936" w:bottom="792" w:left="936" w:header="720" w:footer="720" w:gutter="0"/>
+      <w:pgSz w:w="11906" w:h="16838" w:code="9"/>
+      <w:pgMar w:top="720" w:right="720" w:bottom="720" w:left="720" w:header="720" w:footer="720" w:gutter="0"/>
       <w:cols w:space="720"/>
       <w:docGrid w:linePitch="360"/>
     </w:sectPr>
@@ -649,7 +1067,7 @@
 </file>
 
 <file path=word/endnotes.xml><?xml version="1.0" encoding="utf-8"?>
-<w:endnotes xmlns:wpc="http://schemas.microsoft.com/office/word/2010/wordprocessingCanvas" xmlns:cx="http://schemas.microsoft.com/office/drawing/2014/chartex" xmlns:cx1="http://schemas.microsoft.com/office/drawing/2015/9/8/chartex" xmlns:cx2="http://schemas.microsoft.com/office/drawing/2015/10/21/chartex" xmlns:cx3="http://schemas.microsoft.com/office/drawing/2016/5/9/chartex" xmlns:cx4="http://schemas.microsoft.com/office/drawing/2016/5/10/chartex" xmlns:cx5="http://schemas.microsoft.com/office/drawing/2016/5/11/chartex" xmlns:cx6="http://schemas.microsoft.com/office/drawing/2016/5/12/chartex" xmlns:cx7="http://schemas.microsoft.com/office/drawing/2016/5/13/chartex" xmlns:cx8="http://schemas.microsoft.com/office/drawing/2016/5/14/chartex" xmlns:mc="http://schemas.openxmlformats.org/markup-compatibility/2006" xmlns:m="http://schemas.openxmlformats.org/officeDocument/2006/math" xmlns:aink="http://schemas.microsoft.com/office/drawing/2016/ink" xmlns:am3d="http://schemas.microsoft.com/office/drawing/2017/model3d" xmlns:oel="http://schemas.microsoft.com/office/2019/extlst" xmlns:r="http://schemas.openxmlformats.org/officeDocument/2006/relationships" xmlns:wp14="http://schemas.microsoft.com/office/word/2010/wordprocessingDrawing" xmlns:wp="http://schemas.openxmlformats.org/drawingml/2006/wordprocessingDrawing" xmlns:wpg="http://schemas.microsoft.com/office/word/2010/wordprocessingGroup" xmlns:wpi="http://schemas.microsoft.com/office/word/2010/wordprocessingInk" xmlns:wps="http://schemas.microsoft.com/office/word/2010/wordprocessingShape" xmlns:o="urn:schemas-microsoft-com:office:office" xmlns:v="urn:schemas-microsoft-com:vml" xmlns:w10="urn:schemas-microsoft-com:office:word" xmlns:w="http://schemas.openxmlformats.org/wordprocessingml/2006/main" xmlns:w14="http://schemas.microsoft.com/office/word/2010/wordml" xmlns:w15="http://schemas.microsoft.com/office/word/2012/wordml" xmlns:w16cei="http://schemas.microsoft.com/office/word/2026/wordml/cei" xmlns:w16cex="http://schemas.microsoft.com/office/word/2018/wordml/cex" xmlns:w16cid="http://schemas.microsoft.com/office/word/2016/wordml/cid" xmlns:w16="http://schemas.microsoft.com/office/word/2018/wordml" xmlns:w16sdtdh="http://schemas.microsoft.com/office/word/2020/wordml/sdtdatahash" xmlns:w16sdtfl="http://schemas.microsoft.com/office/word/2024/wordml/sdtformatlock" xmlns:w16se="http://schemas.microsoft.com/office/word/2015/wordml/symex" xmlns:w16du="http://schemas.microsoft.com/office/word/2023/wordml/word16du" xmlns:wne="http://schemas.microsoft.com/office/word/2006/wordml" mc:Ignorable="w14 w15 w16se w16cid w16 w16cex w16sdtdh w16sdtfl w16du wp14">
+<w:endnotes xmlns:wpc="http://schemas.microsoft.com/office/word/2010/wordprocessingCanvas" xmlns:cx="http://schemas.microsoft.com/office/drawing/2014/chartex" xmlns:cx1="http://schemas.microsoft.com/office/drawing/2015/9/8/chartex" xmlns:cx2="http://schemas.microsoft.com/office/drawing/2015/10/21/chartex" xmlns:cx3="http://schemas.microsoft.com/office/drawing/2016/5/9/chartex" xmlns:cx4="http://schemas.microsoft.com/office/drawing/2016/5/10/chartex" xmlns:cx5="http://schemas.microsoft.com/office/drawing/2016/5/11/chartex" xmlns:cx6="http://schemas.microsoft.com/office/drawing/2016/5/12/chartex" xmlns:cx7="http://schemas.microsoft.com/office/drawing/2016/5/13/chartex" xmlns:cx8="http://schemas.microsoft.com/office/drawing/2016/5/14/chartex" xmlns:mc="http://schemas.openxmlformats.org/markup-compatibility/2006" xmlns:aink="http://schemas.microsoft.com/office/drawing/2016/ink" xmlns:am3d="http://schemas.microsoft.com/office/drawing/2017/model3d" xmlns:o="urn:schemas-microsoft-com:office:office" xmlns:r="http://schemas.openxmlformats.org/officeDocument/2006/relationships" xmlns:m="http://schemas.openxmlformats.org/officeDocument/2006/math" xmlns:v="urn:schemas-microsoft-com:vml" xmlns:wp14="http://schemas.microsoft.com/office/word/2010/wordprocessingDrawing" xmlns:wp="http://schemas.openxmlformats.org/drawingml/2006/wordprocessingDrawing" xmlns:w10="urn:schemas-microsoft-com:office:word" xmlns:w="http://schemas.openxmlformats.org/wordprocessingml/2006/main" xmlns:w14="http://schemas.microsoft.com/office/word/2010/wordml" xmlns:w15="http://schemas.microsoft.com/office/word/2012/wordml" xmlns:w16cex="http://schemas.microsoft.com/office/word/2018/wordml/cex" xmlns:w16cid="http://schemas.microsoft.com/office/word/2016/wordml/cid" xmlns:w16="http://schemas.microsoft.com/office/word/2018/wordml" xmlns:w16sdtdh="http://schemas.microsoft.com/office/word/2020/wordml/sdtdatahash" xmlns:w16se="http://schemas.microsoft.com/office/word/2015/wordml/symex" xmlns:wpg="http://schemas.microsoft.com/office/word/2010/wordprocessingGroup" xmlns:wpi="http://schemas.microsoft.com/office/word/2010/wordprocessingInk" xmlns:wne="http://schemas.microsoft.com/office/word/2006/wordml" xmlns:wps="http://schemas.microsoft.com/office/word/2010/wordprocessingShape" mc:Ignorable="w14 w15 w16se w16cid w16 w16cex w16sdtdh wp14">
   <w:endnote w:type="separator" w:id="-1">
     <w:p>
       <w:pPr>
@@ -674,24 +1092,32 @@
 </file>
 
 <file path=word/footer1.xml><?xml version="1.0" encoding="utf-8"?>
-<w:ftr xmlns:wpc="http://schemas.microsoft.com/office/word/2010/wordprocessingCanvas" xmlns:cx="http://schemas.microsoft.com/office/drawing/2014/chartex" xmlns:cx1="http://schemas.microsoft.com/office/drawing/2015/9/8/chartex" xmlns:cx2="http://schemas.microsoft.com/office/drawing/2015/10/21/chartex" xmlns:cx3="http://schemas.microsoft.com/office/drawing/2016/5/9/chartex" xmlns:cx4="http://schemas.microsoft.com/office/drawing/2016/5/10/chartex" xmlns:cx5="http://schemas.microsoft.com/office/drawing/2016/5/11/chartex" xmlns:cx6="http://schemas.microsoft.com/office/drawing/2016/5/12/chartex" xmlns:cx7="http://schemas.microsoft.com/office/drawing/2016/5/13/chartex" xmlns:cx8="http://schemas.microsoft.com/office/drawing/2016/5/14/chartex" xmlns:mc="http://schemas.openxmlformats.org/markup-compatibility/2006" xmlns:m="http://schemas.openxmlformats.org/officeDocument/2006/math" xmlns:aink="http://schemas.microsoft.com/office/drawing/2016/ink" xmlns:am3d="http://schemas.microsoft.com/office/drawing/2017/model3d" xmlns:oel="http://schemas.microsoft.com/office/2019/extlst" xmlns:r="http://schemas.openxmlformats.org/officeDocument/2006/relationships" xmlns:wp14="http://schemas.microsoft.com/office/word/2010/wordprocessingDrawing" xmlns:wp="http://schemas.openxmlformats.org/drawingml/2006/wordprocessingDrawing" xmlns:wpg="http://schemas.microsoft.com/office/word/2010/wordprocessingGroup" xmlns:wpi="http://schemas.microsoft.com/office/word/2010/wordprocessingInk" xmlns:wps="http://schemas.microsoft.com/office/word/2010/wordprocessingShape" xmlns:o="urn:schemas-microsoft-com:office:office" xmlns:v="urn:schemas-microsoft-com:vml" xmlns:w10="urn:schemas-microsoft-com:office:word" xmlns:w="http://schemas.openxmlformats.org/wordprocessingml/2006/main" xmlns:w14="http://schemas.microsoft.com/office/word/2010/wordml" xmlns:w15="http://schemas.microsoft.com/office/word/2012/wordml" xmlns:w16cei="http://schemas.microsoft.com/office/word/2026/wordml/cei" xmlns:w16cex="http://schemas.microsoft.com/office/word/2018/wordml/cex" xmlns:w16cid="http://schemas.microsoft.com/office/word/2016/wordml/cid" xmlns:w16="http://schemas.microsoft.com/office/word/2018/wordml" xmlns:w16sdtdh="http://schemas.microsoft.com/office/word/2020/wordml/sdtdatahash" xmlns:w16sdtfl="http://schemas.microsoft.com/office/word/2024/wordml/sdtformatlock" xmlns:w16se="http://schemas.microsoft.com/office/word/2015/wordml/symex" xmlns:w16du="http://schemas.microsoft.com/office/word/2023/wordml/word16du" xmlns:wne="http://schemas.microsoft.com/office/word/2006/wordml" mc:Ignorable="w14 w15 w16se w16cid w16 w16cex w16sdtdh w16sdtfl w16du wp14">
+<w:ftr xmlns:wpc="http://schemas.microsoft.com/office/word/2010/wordprocessingCanvas" xmlns:cx="http://schemas.microsoft.com/office/drawing/2014/chartex" xmlns:cx1="http://schemas.microsoft.com/office/drawing/2015/9/8/chartex" xmlns:cx2="http://schemas.microsoft.com/office/drawing/2015/10/21/chartex" xmlns:cx3="http://schemas.microsoft.com/office/drawing/2016/5/9/chartex" xmlns:cx4="http://schemas.microsoft.com/office/drawing/2016/5/10/chartex" xmlns:cx5="http://schemas.microsoft.com/office/drawing/2016/5/11/chartex" xmlns:cx6="http://schemas.microsoft.com/office/drawing/2016/5/12/chartex" xmlns:cx7="http://schemas.microsoft.com/office/drawing/2016/5/13/chartex" xmlns:cx8="http://schemas.microsoft.com/office/drawing/2016/5/14/chartex" xmlns:mc="http://schemas.openxmlformats.org/markup-compatibility/2006" xmlns:aink="http://schemas.microsoft.com/office/drawing/2016/ink" xmlns:am3d="http://schemas.microsoft.com/office/drawing/2017/model3d" xmlns:o="urn:schemas-microsoft-com:office:office" xmlns:r="http://schemas.openxmlformats.org/officeDocument/2006/relationships" xmlns:m="http://schemas.openxmlformats.org/officeDocument/2006/math" xmlns:v="urn:schemas-microsoft-com:vml" xmlns:wp14="http://schemas.microsoft.com/office/word/2010/wordprocessingDrawing" xmlns:wp="http://schemas.openxmlformats.org/drawingml/2006/wordprocessingDrawing" xmlns:w10="urn:schemas-microsoft-com:office:word" xmlns:w="http://schemas.openxmlformats.org/wordprocessingml/2006/main" xmlns:w14="http://schemas.microsoft.com/office/word/2010/wordml" xmlns:w15="http://schemas.microsoft.com/office/word/2012/wordml" xmlns:w16cex="http://schemas.microsoft.com/office/word/2018/wordml/cex" xmlns:w16cid="http://schemas.microsoft.com/office/word/2016/wordml/cid" xmlns:w16="http://schemas.microsoft.com/office/word/2018/wordml" xmlns:w16sdtdh="http://schemas.microsoft.com/office/word/2020/wordml/sdtdatahash" xmlns:w16se="http://schemas.microsoft.com/office/word/2015/wordml/symex" xmlns:wpg="http://schemas.microsoft.com/office/word/2010/wordprocessingGroup" xmlns:wpi="http://schemas.microsoft.com/office/word/2010/wordprocessingInk" xmlns:wne="http://schemas.microsoft.com/office/word/2006/wordml" xmlns:wps="http://schemas.microsoft.com/office/word/2010/wordprocessingShape" mc:Ignorable="w14 w15 w16se w16cid w16 w16cex w16sdtdh wp14">
   <w:p>
     <w:pPr>
-      <w:pStyle w:val="Footer"/>
+      <w:spacing w:before="120" w:after="0"/>
       <w:jc w:val="center"/>
+      <w:rPr>
+        <w:rFonts w:ascii="Inter" w:hAnsi="Inter"/>
+        <w:sz w:val="18"/>
+        <w:szCs w:val="18"/>
+      </w:rPr>
     </w:pPr>
     <w:r>
       <w:rPr>
-        <w:sz w:val="16"/>
-      </w:rPr>
-      <w:t>Research Participant Interview Consent Form</w:t>
+        <w:rFonts w:ascii="Inter" w:hAnsi="Inter"/>
+        <w:i/>
+        <w:sz w:val="18"/>
+        <w:szCs w:val="18"/>
+      </w:rPr>
+      <w:t>Keep one copy of this form with the research records. Provide a copy to the participant upon request.</w:t>
     </w:r>
   </w:p>
 </w:ftr>
 </file>
 
 <file path=word/footnotes.xml><?xml version="1.0" encoding="utf-8"?>
-<w:footnotes xmlns:wpc="http://schemas.microsoft.com/office/word/2010/wordprocessingCanvas" xmlns:cx="http://schemas.microsoft.com/office/drawing/2014/chartex" xmlns:cx1="http://schemas.microsoft.com/office/drawing/2015/9/8/chartex" xmlns:cx2="http://schemas.microsoft.com/office/drawing/2015/10/21/chartex" xmlns:cx3="http://schemas.microsoft.com/office/drawing/2016/5/9/chartex" xmlns:cx4="http://schemas.microsoft.com/office/drawing/2016/5/10/chartex" xmlns:cx5="http://schemas.microsoft.com/office/drawing/2016/5/11/chartex" xmlns:cx6="http://schemas.microsoft.com/office/drawing/2016/5/12/chartex" xmlns:cx7="http://schemas.microsoft.com/office/drawing/2016/5/13/chartex" xmlns:cx8="http://schemas.microsoft.com/office/drawing/2016/5/14/chartex" xmlns:mc="http://schemas.openxmlformats.org/markup-compatibility/2006" xmlns:m="http://schemas.openxmlformats.org/officeDocument/2006/math" xmlns:aink="http://schemas.microsoft.com/office/drawing/2016/ink" xmlns:am3d="http://schemas.microsoft.com/office/drawing/2017/model3d" xmlns:oel="http://schemas.microsoft.com/office/2019/extlst" xmlns:r="http://schemas.openxmlformats.org/officeDocument/2006/relationships" xmlns:wp14="http://schemas.microsoft.com/office/word/2010/wordprocessingDrawing" xmlns:wp="http://schemas.openxmlformats.org/drawingml/2006/wordprocessingDrawing" xmlns:wpg="http://schemas.microsoft.com/office/word/2010/wordprocessingGroup" xmlns:wpi="http://schemas.microsoft.com/office/word/2010/wordprocessingInk" xmlns:wps="http://schemas.microsoft.com/office/word/2010/wordprocessingShape" xmlns:o="urn:schemas-microsoft-com:office:office" xmlns:v="urn:schemas-microsoft-com:vml" xmlns:w10="urn:schemas-microsoft-com:office:word" xmlns:w="http://schemas.openxmlformats.org/wordprocessingml/2006/main" xmlns:w14="http://schemas.microsoft.com/office/word/2010/wordml" xmlns:w15="http://schemas.microsoft.com/office/word/2012/wordml" xmlns:w16cei="http://schemas.microsoft.com/office/word/2026/wordml/cei" xmlns:w16cex="http://schemas.microsoft.com/office/word/2018/wordml/cex" xmlns:w16cid="http://schemas.microsoft.com/office/word/2016/wordml/cid" xmlns:w16="http://schemas.microsoft.com/office/word/2018/wordml" xmlns:w16sdtdh="http://schemas.microsoft.com/office/word/2020/wordml/sdtdatahash" xmlns:w16sdtfl="http://schemas.microsoft.com/office/word/2024/wordml/sdtformatlock" xmlns:w16se="http://schemas.microsoft.com/office/word/2015/wordml/symex" xmlns:w16du="http://schemas.microsoft.com/office/word/2023/wordml/word16du" xmlns:wne="http://schemas.microsoft.com/office/word/2006/wordml" mc:Ignorable="w14 w15 w16se w16cid w16 w16cex w16sdtdh w16sdtfl w16du wp14">
+<w:footnotes xmlns:wpc="http://schemas.microsoft.com/office/word/2010/wordprocessingCanvas" xmlns:cx="http://schemas.microsoft.com/office/drawing/2014/chartex" xmlns:cx1="http://schemas.microsoft.com/office/drawing/2015/9/8/chartex" xmlns:cx2="http://schemas.microsoft.com/office/drawing/2015/10/21/chartex" xmlns:cx3="http://schemas.microsoft.com/office/drawing/2016/5/9/chartex" xmlns:cx4="http://schemas.microsoft.com/office/drawing/2016/5/10/chartex" xmlns:cx5="http://schemas.microsoft.com/office/drawing/2016/5/11/chartex" xmlns:cx6="http://schemas.microsoft.com/office/drawing/2016/5/12/chartex" xmlns:cx7="http://schemas.microsoft.com/office/drawing/2016/5/13/chartex" xmlns:cx8="http://schemas.microsoft.com/office/drawing/2016/5/14/chartex" xmlns:mc="http://schemas.openxmlformats.org/markup-compatibility/2006" xmlns:aink="http://schemas.microsoft.com/office/drawing/2016/ink" xmlns:am3d="http://schemas.microsoft.com/office/drawing/2017/model3d" xmlns:o="urn:schemas-microsoft-com:office:office" xmlns:r="http://schemas.openxmlformats.org/officeDocument/2006/relationships" xmlns:m="http://schemas.openxmlformats.org/officeDocument/2006/math" xmlns:v="urn:schemas-microsoft-com:vml" xmlns:wp14="http://schemas.microsoft.com/office/word/2010/wordprocessingDrawing" xmlns:wp="http://schemas.openxmlformats.org/drawingml/2006/wordprocessingDrawing" xmlns:w10="urn:schemas-microsoft-com:office:word" xmlns:w="http://schemas.openxmlformats.org/wordprocessingml/2006/main" xmlns:w14="http://schemas.microsoft.com/office/word/2010/wordml" xmlns:w15="http://schemas.microsoft.com/office/word/2012/wordml" xmlns:w16cex="http://schemas.microsoft.com/office/word/2018/wordml/cex" xmlns:w16cid="http://schemas.microsoft.com/office/word/2016/wordml/cid" xmlns:w16="http://schemas.microsoft.com/office/word/2018/wordml" xmlns:w16sdtdh="http://schemas.microsoft.com/office/word/2020/wordml/sdtdatahash" xmlns:w16se="http://schemas.microsoft.com/office/word/2015/wordml/symex" xmlns:wpg="http://schemas.microsoft.com/office/word/2010/wordprocessingGroup" xmlns:wpi="http://schemas.microsoft.com/office/word/2010/wordprocessingInk" xmlns:wne="http://schemas.microsoft.com/office/word/2006/wordml" xmlns:wps="http://schemas.microsoft.com/office/word/2010/wordprocessingShape" mc:Ignorable="w14 w15 w16se w16cid w16 w16cex w16sdtdh wp14">
   <w:footnote w:type="separator" w:id="-1">
     <w:p>
       <w:pPr>
@@ -716,7 +1142,7 @@
 </file>
 
 <file path=word/numbering.xml><?xml version="1.0" encoding="utf-8"?>
-<w:numbering xmlns:wpc="http://schemas.microsoft.com/office/word/2010/wordprocessingCanvas" xmlns:cx="http://schemas.microsoft.com/office/drawing/2014/chartex" xmlns:cx1="http://schemas.microsoft.com/office/drawing/2015/9/8/chartex" xmlns:cx2="http://schemas.microsoft.com/office/drawing/2015/10/21/chartex" xmlns:cx3="http://schemas.microsoft.com/office/drawing/2016/5/9/chartex" xmlns:cx4="http://schemas.microsoft.com/office/drawing/2016/5/10/chartex" xmlns:cx5="http://schemas.microsoft.com/office/drawing/2016/5/11/chartex" xmlns:cx6="http://schemas.microsoft.com/office/drawing/2016/5/12/chartex" xmlns:cx7="http://schemas.microsoft.com/office/drawing/2016/5/13/chartex" xmlns:cx8="http://schemas.microsoft.com/office/drawing/2016/5/14/chartex" xmlns:mc="http://schemas.openxmlformats.org/markup-compatibility/2006" xmlns:m="http://schemas.openxmlformats.org/officeDocument/2006/math" xmlns:aink="http://schemas.microsoft.com/office/drawing/2016/ink" xmlns:am3d="http://schemas.microsoft.com/office/drawing/2017/model3d" xmlns:oel="http://schemas.microsoft.com/office/2019/extlst" xmlns:r="http://schemas.openxmlformats.org/officeDocument/2006/relationships" xmlns:wp14="http://schemas.microsoft.com/office/word/2010/wordprocessingDrawing" xmlns:wp="http://schemas.openxmlformats.org/drawingml/2006/wordprocessingDrawing" xmlns:wpg="http://schemas.microsoft.com/office/word/2010/wordprocessingGroup" xmlns:wpi="http://schemas.microsoft.com/office/word/2010/wordprocessingInk" xmlns:wps="http://schemas.microsoft.com/office/word/2010/wordprocessingShape" xmlns:o="urn:schemas-microsoft-com:office:office" xmlns:v="urn:schemas-microsoft-com:vml" xmlns:w10="urn:schemas-microsoft-com:office:word" xmlns:w="http://schemas.openxmlformats.org/wordprocessingml/2006/main" xmlns:w14="http://schemas.microsoft.com/office/word/2010/wordml" xmlns:w15="http://schemas.microsoft.com/office/word/2012/wordml" xmlns:w16cei="http://schemas.microsoft.com/office/word/2026/wordml/cei" xmlns:w16cex="http://schemas.microsoft.com/office/word/2018/wordml/cex" xmlns:w16cid="http://schemas.microsoft.com/office/word/2016/wordml/cid" xmlns:w16="http://schemas.microsoft.com/office/word/2018/wordml" xmlns:w16sdtdh="http://schemas.microsoft.com/office/word/2020/wordml/sdtdatahash" xmlns:w16sdtfl="http://schemas.microsoft.com/office/word/2024/wordml/sdtformatlock" xmlns:w16se="http://schemas.microsoft.com/office/word/2015/wordml/symex" xmlns:w16du="http://schemas.microsoft.com/office/word/2023/wordml/word16du" xmlns:wne="http://schemas.microsoft.com/office/word/2006/wordml" mc:Ignorable="w14 w15 w16se w16cid w16 w16cex w16sdtdh w16sdtfl w16du wp14">
+<w:numbering xmlns:wpc="http://schemas.microsoft.com/office/word/2010/wordprocessingCanvas" xmlns:cx="http://schemas.microsoft.com/office/drawing/2014/chartex" xmlns:cx1="http://schemas.microsoft.com/office/drawing/2015/9/8/chartex" xmlns:cx2="http://schemas.microsoft.com/office/drawing/2015/10/21/chartex" xmlns:cx3="http://schemas.microsoft.com/office/drawing/2016/5/9/chartex" xmlns:cx4="http://schemas.microsoft.com/office/drawing/2016/5/10/chartex" xmlns:cx5="http://schemas.microsoft.com/office/drawing/2016/5/11/chartex" xmlns:cx6="http://schemas.microsoft.com/office/drawing/2016/5/12/chartex" xmlns:cx7="http://schemas.microsoft.com/office/drawing/2016/5/13/chartex" xmlns:cx8="http://schemas.microsoft.com/office/drawing/2016/5/14/chartex" xmlns:mc="http://schemas.openxmlformats.org/markup-compatibility/2006" xmlns:aink="http://schemas.microsoft.com/office/drawing/2016/ink" xmlns:am3d="http://schemas.microsoft.com/office/drawing/2017/model3d" xmlns:o="urn:schemas-microsoft-com:office:office" xmlns:r="http://schemas.openxmlformats.org/officeDocument/2006/relationships" xmlns:m="http://schemas.openxmlformats.org/officeDocument/2006/math" xmlns:v="urn:schemas-microsoft-com:vml" xmlns:wp14="http://schemas.microsoft.com/office/word/2010/wordprocessingDrawing" xmlns:wp="http://schemas.openxmlformats.org/drawingml/2006/wordprocessingDrawing" xmlns:w10="urn:schemas-microsoft-com:office:word" xmlns:w="http://schemas.openxmlformats.org/wordprocessingml/2006/main" xmlns:w14="http://schemas.microsoft.com/office/word/2010/wordml" xmlns:w15="http://schemas.microsoft.com/office/word/2012/wordml" xmlns:w16cex="http://schemas.microsoft.com/office/word/2018/wordml/cex" xmlns:w16cid="http://schemas.microsoft.com/office/word/2016/wordml/cid" xmlns:w16="http://schemas.microsoft.com/office/word/2018/wordml" xmlns:w16sdtdh="http://schemas.microsoft.com/office/word/2020/wordml/sdtdatahash" xmlns:w16se="http://schemas.microsoft.com/office/word/2015/wordml/symex" xmlns:wpg="http://schemas.microsoft.com/office/word/2010/wordprocessingGroup" xmlns:wpi="http://schemas.microsoft.com/office/word/2010/wordprocessingInk" xmlns:wne="http://schemas.microsoft.com/office/word/2006/wordml" xmlns:wps="http://schemas.microsoft.com/office/word/2010/wordprocessingShape" mc:Ignorable="w14 w15 w16se w16cid w16 w16cex w16sdtdh wp14">
   <w:abstractNum w:abstractNumId="0" w15:restartNumberingAfterBreak="0">
     <w:nsid w:val="FFFFFF7C"/>
     <w:multiLevelType w:val="singleLevel"/>
@@ -888,38 +1314,38 @@
       </w:rPr>
     </w:lvl>
   </w:abstractNum>
-  <w:num w:numId="1" w16cid:durableId="1512599359">
+  <w:num w:numId="1">
     <w:abstractNumId w:val="8"/>
   </w:num>
-  <w:num w:numId="2" w16cid:durableId="605621048">
+  <w:num w:numId="2">
     <w:abstractNumId w:val="6"/>
   </w:num>
-  <w:num w:numId="3" w16cid:durableId="832913778">
+  <w:num w:numId="3">
     <w:abstractNumId w:val="5"/>
   </w:num>
-  <w:num w:numId="4" w16cid:durableId="2061053209">
+  <w:num w:numId="4">
     <w:abstractNumId w:val="4"/>
   </w:num>
-  <w:num w:numId="5" w16cid:durableId="631979416">
+  <w:num w:numId="5">
     <w:abstractNumId w:val="7"/>
   </w:num>
-  <w:num w:numId="6" w16cid:durableId="1188517564">
+  <w:num w:numId="6">
     <w:abstractNumId w:val="3"/>
   </w:num>
-  <w:num w:numId="7" w16cid:durableId="739013851">
+  <w:num w:numId="7">
     <w:abstractNumId w:val="2"/>
   </w:num>
-  <w:num w:numId="8" w16cid:durableId="1302425323">
+  <w:num w:numId="8">
     <w:abstractNumId w:val="1"/>
   </w:num>
-  <w:num w:numId="9" w16cid:durableId="607397879">
+  <w:num w:numId="9">
     <w:abstractNumId w:val="0"/>
   </w:num>
 </w:numbering>
 </file>
 
 <file path=word/styles.xml><?xml version="1.0" encoding="utf-8"?>
-<w:styles xmlns:mc="http://schemas.openxmlformats.org/markup-compatibility/2006" xmlns:r="http://schemas.openxmlformats.org/officeDocument/2006/relationships" xmlns:w="http://schemas.openxmlformats.org/wordprocessingml/2006/main" xmlns:w14="http://schemas.microsoft.com/office/word/2010/wordml" xmlns:w15="http://schemas.microsoft.com/office/word/2012/wordml" xmlns:w16cex="http://schemas.microsoft.com/office/word/2018/wordml/cex" xmlns:w16cid="http://schemas.microsoft.com/office/word/2016/wordml/cid" xmlns:w16="http://schemas.microsoft.com/office/word/2018/wordml" xmlns:w16sdtdh="http://schemas.microsoft.com/office/word/2020/wordml/sdtdatahash" xmlns:w16sdtfl="http://schemas.microsoft.com/office/word/2024/wordml/sdtformatlock" xmlns:w16se="http://schemas.microsoft.com/office/word/2015/wordml/symex" xmlns:w16du="http://schemas.microsoft.com/office/word/2023/wordml/word16du" mc:Ignorable="w14 w15 w16se w16cid w16 w16cex w16sdtdh w16sdtfl w16du">
+<w:styles xmlns:mc="http://schemas.openxmlformats.org/markup-compatibility/2006" xmlns:r="http://schemas.openxmlformats.org/officeDocument/2006/relationships" xmlns:w="http://schemas.openxmlformats.org/wordprocessingml/2006/main" xmlns:w14="http://schemas.microsoft.com/office/word/2010/wordml" xmlns:w15="http://schemas.microsoft.com/office/word/2012/wordml" xmlns:w16cex="http://schemas.microsoft.com/office/word/2018/wordml/cex" xmlns:w16cid="http://schemas.microsoft.com/office/word/2016/wordml/cid" xmlns:w16="http://schemas.microsoft.com/office/word/2018/wordml" xmlns:w16sdtdh="http://schemas.microsoft.com/office/word/2020/wordml/sdtdatahash" xmlns:w16se="http://schemas.microsoft.com/office/word/2015/wordml/symex" mc:Ignorable="w14 w15 w16se w16cid w16 w16cex w16sdtdh">
   <w:docDefaults>
     <w:rPrDefault>
       <w:rPr>

</xml_diff>

<commit_message>
docs(evaluation): document in-app Test COG Fixtures dropdown on admin review page
</commit_message>
<xml_diff>
--- a/docs/Research_Participant_Interview_Consent_Form.docx
+++ b/docs/Research_Participant_Interview_Consent_Form.docx
@@ -438,7 +438,23 @@
           <w:sz w:val="18"/>
           <w:szCs w:val="18"/>
         </w:rPr>
-        <w:t xml:space="preserve">We, the researchers, are </w:t>
+        <w:t xml:space="preserve">We, the </w:t>
+      </w:r>
+      <w:r>
+        <w:rPr>
+          <w:rFonts w:ascii="Inter" w:hAnsi="Inter"/>
+          <w:sz w:val="18"/>
+          <w:szCs w:val="18"/>
+        </w:rPr>
+        <w:t>proponents</w:t>
+      </w:r>
+      <w:r>
+        <w:rPr>
+          <w:rFonts w:ascii="Inter" w:hAnsi="Inter"/>
+          <w:sz w:val="18"/>
+          <w:szCs w:val="18"/>
+        </w:rPr>
+        <w:t xml:space="preserve">, are </w:t>
       </w:r>
       <w:r>
         <w:rPr>
@@ -1021,25 +1037,7 @@
                 <w:sz w:val="16"/>
                 <w:szCs w:val="16"/>
               </w:rPr>
-              <w:t xml:space="preserve">Researcher Contact / Email:  </w:t>
-            </w:r>
-            <w:proofErr w:type="gramStart"/>
-            <w:r>
-              <w:rPr>
-                <w:rFonts w:ascii="Inter" w:hAnsi="Inter"/>
-                <w:sz w:val="16"/>
-                <w:szCs w:val="16"/>
-              </w:rPr>
-              <w:t>johnandrei.carillo@clsu2.edu.ph  |</w:t>
-            </w:r>
-            <w:proofErr w:type="gramEnd"/>
-            <w:r>
-              <w:rPr>
-                <w:rFonts w:ascii="Inter" w:hAnsi="Inter"/>
-                <w:sz w:val="16"/>
-                <w:szCs w:val="16"/>
-              </w:rPr>
-              <w:t xml:space="preserve">  noriel.gadiano@clsu2.edu.ph  |  joshua.razon@clsu2.edu.ph</w:t>
+              <w:t>Researcher Contact / Email:  johnandrei.carillo@clsu2.edu.ph  |  noriel.gadiano@clsu2.edu.ph  |  joshua.razon@clsu2.edu.ph</w:t>
             </w:r>
           </w:p>
         </w:tc>

</xml_diff>